<commit_message>
Sync manuscript edits (Mar 13) + rebuild DOCX/EPUB
</commit_message>
<xml_diff>
--- a/public/matc-part-one.docx
+++ b/public/matc-part-one.docx
@@ -1934,15 +1934,15 @@
         <w:pStyle w:val="BodyText"/>
       </w:pPr>
       <w:r>
-        <w:t xml:space="preserve">Forty-seven individuals, arranged in four rows, standing upright in alcoves carved into the stone. Each one was connected to an Elder Stone by Blood Vine — the vine entering through the skin at the base of the skull, threading down the spine, wrapping the torso like ivy on a post. The Elder Stones were positioned at chest height, pulsing with the same reddish light as the walls, each one draining at a rate calibrated to extract the maximum amount of magical memory without killing the host.</w:t>
-      </w:r>
-    </w:p>
-    <w:p>
-      <w:pPr>
-        <w:pStyle w:val="BodyText"/>
-      </w:pPr>
-      <w:r>
-        <w:t xml:space="preserve">The hosts were alive. Technically. Their hearts beat. Their lungs drew air. Their eyes, in most cases, were open — staring at nothing, tracking nothing, emptied of everything that had once made them people. A woman from the Core, thick-shouldered, her Molder’s hands still calloused even after years of stillness. A man from the Sea, blue-tinged skin, his Guide-sense so thoroughly drained that his body had begun to drift in the alcove as if it had forgotten which way was down. A pair of twins from the Canopy — Knowers, both, taken in the same raid — their faces still oriented toward each other, mouths slightly open, a conversation suspended mid-sentence a decade ago.</w:t>
+        <w:t xml:space="preserve">Forty-seven individuals, arranged in four rows on stone platforms that lined the Chamber like beds in a ward. Each one was connected to a personal Elder Stone by Blood Vine — the vine entering through the temples and wrists and throat, threading along the body in organized lines, the Elder Stones embedded in the platforms beside each person’s head. The Stones pulsed with the same reddish light as the walls, each one draining at a rate calibrated to extract the maximum amount of magical memory without killing the host.</w:t>
+      </w:r>
+    </w:p>
+    <w:p>
+      <w:pPr>
+        <w:pStyle w:val="BodyText"/>
+      </w:pPr>
+      <w:r>
+        <w:t xml:space="preserve">The hosts were alive. Technically. Their hearts beat. Their lungs drew air. Their eyes, in most cases, were open — staring at nothing, tracking nothing, emptied of everything that had once made them people. A woman from the Core, thick-shouldered, her Molder’s hands still calloused even after years of stillness. A man from the Sea, blue-tinged skin, his Guide-sense so thoroughly drained that his body had begun to drift on the platform as if it had forgotten which way was down. A pair of twins from the Canopy — Knowers, both, taken in the same raid — their faces still turned toward each other on adjacent platforms, mouths slightly open, a conversation suspended mid-sentence a decade ago.</w:t>
       </w:r>
     </w:p>
     <w:p>
@@ -2014,7 +2014,7 @@
         <w:pStyle w:val="BodyText"/>
       </w:pPr>
       <w:r>
-        <w:t xml:space="preserve">Row four, alcove six. A Ming woman. Old — ancient, really, her skin like paper over kindling, her frame so diminished by decades of draining that the Blood Vine seemed to be the only thing holding her upright. She had been in the collection longer than The Knife had been alive. She was, according to the log, categorized as</w:t>
+        <w:t xml:space="preserve">Row four, platform six. A Ming woman. Old — ancient, really, her skin like paper over kindling, her frame so diminished by decades of draining that the Blood Vine seemed to be the only thing keeping her breathing. She had been in the collection longer than The Knife had been alive. She was, according to the log, categorized as</w:t>
       </w:r>
       <w:r>
         <w:t xml:space="preserve"> </w:t>
@@ -2043,7 +2043,7 @@
         <w:pStyle w:val="BodyText"/>
       </w:pPr>
       <w:r>
-        <w:t xml:space="preserve">Not the involuntary drift that sometimes occurred when the brain stem fired randomly. Moving. Tracking. Following The Knife as he walked past her alcove with the focused, deliberate attention of a person who was</w:t>
+        <w:t xml:space="preserve">Not the involuntary drift that sometimes occurred when the brain stem fired randomly. Moving. Tracking. Following The Knife as he walked past her platform with the focused, deliberate attention of a person who was</w:t>
       </w:r>
       <w:r>
         <w:t xml:space="preserve"> </w:t>
@@ -2125,7 +2125,7 @@
           <w:i/>
           <w:iCs/>
         </w:rPr>
-        <w:t xml:space="preserve">Row 4, Alcove 6: Elevated awareness. Motor function. Monitor.</w:t>
+        <w:t xml:space="preserve">Row 4, Platform 6: Elevated awareness. Motor function. Monitor.</w:t>
       </w:r>
     </w:p>
     <w:p>
@@ -5147,15 +5147,15 @@
         <w:pStyle w:val="BodyText"/>
       </w:pPr>
       <w:r>
-        <w:t xml:space="preserve">The symptoms were there — had been there for decades, accumulating with the patient thoroughness of rust on iron. The joints ached. The eyes, which had once seen the individual threads of light that composed a sunrise, now saw only the sunrise, which was still beautiful but in the diminished way that a painting of a fire is beautiful compared to the fire itself. The skin bruised easily. The teeth — she had lost two in the last century, which was two more than she had lost in the previous ten thousand years, and the absence of them was a small, persistent humiliation, like a god discovering she is capable of tripping.</w:t>
-      </w:r>
-    </w:p>
-    <w:p>
-      <w:pPr>
-        <w:pStyle w:val="BodyText"/>
-      </w:pPr>
-      <w:r>
-        <w:t xml:space="preserve">She was dying. The other six had promised her this —</w:t>
+        <w:t xml:space="preserve">The symptoms were there, had been there for decades, accumulating with the patient thoroughness of rust on iron. The joints ached. The eyes, which had once seen the individual threads of light that composed a sunrise, now saw only the sunrise, which was still beautiful but in the diminished way that a painting of a fire is beautiful compared to the fire itself. The skin bruised easily. The teeth. She had lost two in the last century, which was two more than she had lost in the previous ten thousand years, and the absence of them was a small, persistent humiliation, like a god discovering she is capable of tripping.</w:t>
+      </w:r>
+    </w:p>
+    <w:p>
+      <w:pPr>
+        <w:pStyle w:val="BodyText"/>
+      </w:pPr>
+      <w:r>
+        <w:t xml:space="preserve">She was dying. The other six had promised her this,</w:t>
       </w:r>
       <w:r>
         <w:t xml:space="preserve"> </w:t>
@@ -5168,10 +5168,7 @@
         <w:t xml:space="preserve">you will age, you will weaken, you will end</w:t>
       </w:r>
       <w:r>
-        <w:t xml:space="preserve"> </w:t>
-      </w:r>
-      <w:r>
-        <w:t xml:space="preserve">— and the other six had been right about everything except the speed. Mortality, it turned out, was not a cliff but a slope, and the slope was gentler than advertised, and Sereth had been sliding down it for three centuries with the resigned patience of someone who had committed a crime and was waiting for a sentence that kept being deferred.</w:t>
+        <w:t xml:space="preserve">, and the other six had been right about everything except the speed. Mortality, it turned out, was not a cliff but a slope, and the slope was gentler than advertised, and Sereth had been sliding down it for three centuries with the resigned patience of someone who had committed a crime and was waiting for a sentence that kept being deferred.</w:t>
       </w:r>
     </w:p>
     <w:p>
@@ -5234,7 +5231,7 @@
         <w:pStyle w:val="BodyText"/>
       </w:pPr>
       <w:r>
-        <w:t xml:space="preserve">The other six had done more than punish Sereth. They had punished her gift. Not with fire or flood — with whispers. Small corruptions planted in the world’s memory like seeds in fertile soil. They had not created the draining. They had created the</w:t>
+        <w:t xml:space="preserve">The other six had done more than punish Sereth. They had punished her gift. Not with fire or flood. With whispers. Small corruptions planted in the world’s memory like seeds in fertile soil. They had not created the draining. They had created the</w:t>
       </w:r>
       <w:r>
         <w:t xml:space="preserve"> </w:t>
@@ -5329,7 +5326,7 @@
         <w:pStyle w:val="BodyText"/>
       </w:pPr>
       <w:r>
-        <w:t xml:space="preserve">Her hands were shaking. Not the arthritic tremor that had become her companion in the last fifty years — a different shaking. Cellular. Fundamental. The vibration of a tuning fork struck by a frequency it was designed to match. Her body — this aging, mortal, beautifully crude body — was</w:t>
+        <w:t xml:space="preserve">Her hands were shaking. Not the arthritic tremor that had become her companion in the last fifty years. A different shaking. Cellular. Fundamental. The vibration of a tuning fork struck by a frequency it was designed to match. Her body, this aging, mortal, beautifully crude body, was</w:t>
       </w:r>
       <w:r>
         <w:t xml:space="preserve"> </w:t>
@@ -5462,7 +5459,7 @@
         <w:pStyle w:val="BodyText"/>
       </w:pPr>
       <w:r>
-        <w:t xml:space="preserve">The captain — young, sharp-eyed, the kind of officer who had been promoted for efficiency rather than wisdom — pulled up short.</w:t>
+        <w:t xml:space="preserve">The captain, young, sharp-eyed, the kind of officer who had been promoted for efficiency rather than wisdom, pulled up short.</w:t>
       </w:r>
       <w:r>
         <w:t xml:space="preserve"> </w:t>
@@ -5801,15 +5798,15 @@
         <w:pStyle w:val="BodyText"/>
       </w:pPr>
       <w:r>
-        <w:t xml:space="preserve">Two days in the hollow. Two days of watching the boy sleep and wake and sleep again, his body burning through the last of the herbs the way a furnace burns through kindling — fast, hot, leaving nothing but ash and the raw thing underneath. Two days of Halvar gripping the staff and listening to the forest and feeling the pursuit somewhere to the north, the Mrak Patrol reorganizing, the distance between them and the hunters shrinking by increments he could measure in his Molder’s bones.</w:t>
-      </w:r>
-    </w:p>
-    <w:p>
-      <w:pPr>
-        <w:pStyle w:val="BodyText"/>
-      </w:pPr>
-      <w:r>
-        <w:t xml:space="preserve">His hands shook. Not the manageable tremor that Aelo mixed the Fiddleroot for — not the morning flutter that could be steadied by gripping a cup or pressing palms flat against wood. This was withdrawal in full: a vibration that started in the fingers and ran up the forearms and settled in the shoulders until his entire body was a single, sustained note of need. The bottle from the cottage was gone — left on the table, beside the chair with the bad leg, in a life that no longer existed. He had not packed it. Fifteen years of contingency planning — the escape route memorized, the pack pre-loaded, the staff maintained, the safehouse stocked — and he had not packed the bottle.</w:t>
+        <w:t xml:space="preserve">Two days in the hollow. Two days of watching the boy sleep and wake and sleep again, his body burning through the last of the herbs the way a furnace burns through kindling, fast, hot, leaving nothing but ash and the raw thing underneath. Two days of Halvar gripping the staff and listening to the forest and feeling the pursuit somewhere to the north, the Mrak Patrol reorganizing, the distance between them and the hunters shrinking by increments he could measure in his Molder’s bones.</w:t>
+      </w:r>
+    </w:p>
+    <w:p>
+      <w:pPr>
+        <w:pStyle w:val="BodyText"/>
+      </w:pPr>
+      <w:r>
+        <w:t xml:space="preserve">His hands shook. Not the manageable tremor that Aelo mixed the Fiddleroot for, not the morning flutter that could be steadied by gripping a cup or pressing palms flat against wood. This was withdrawal in full: a vibration that started in the fingers and ran up the forearms and settled in the shoulders until his entire body was a single, sustained note of need. The bottle from the cottage was gone — left on the table, beside the chair with the bad leg, in a life that no longer existed. He had not packed it. Fifteen years of contingency planning — the escape route memorized, the pack pre-loaded, the staff maintained, the safehouse stocked. And he had not packed the bottle.</w:t>
       </w:r>
     </w:p>
     <w:p>
@@ -6077,7 +6074,7 @@
         <w:pStyle w:val="BodyText"/>
       </w:pPr>
       <w:r>
-        <w:t xml:space="preserve">He had thought about it for three days. Had tried to find another way. Mold magic could reshape the bones — but Mold magic required a Molder, and every Molder he trusted was dead or imprisoned. Know magic could alter perception — but the Know was the discipline most thoroughly monitored by Varas’s trackers, and any use of it would light a beacon that could be seen from the castle. Heal magic could repair tissue — but Heal could not unmake. It could mend what was broken; it could not break what was whole.</w:t>
+        <w:t xml:space="preserve">He had thought about it for three days. Had tried to find another way. Mold magic could reshape the bones, but Mold magic required a Molder, and every Molder he trusted was dead or imprisoned. Know magic could alter perception, but the Know was the discipline most thoroughly monitored by Varas’s trackers, and any use of it would light a beacon that could be seen from the castle. Heal magic could repair tissue, but Heal could not unmake. It could mend what was broken; it could not break what was whole.</w:t>
       </w:r>
     </w:p>
     <w:p>
@@ -6176,15 +6173,15 @@
         <w:pStyle w:val="BodyText"/>
       </w:pPr>
       <w:r>
-        <w:t xml:space="preserve">The Cloud Palace sat at the highest point of the Cloud Kingdom, on a floating stone so vast it carried its own weather — a mass of ancient rock held aloft by Move magic so old it had become self-sustaining. Above the permanent mist line, where the sky opened in every direction and you could see three regions at once on a clear day, the world reduced to a blue so deep and so unbroken that it stopped being a color and became a feeling. The air was thin. Sound carried strangely — voices arrived before you expected them, as if the altitude compressed the distance between speaking and hearing. Light behaved differently too; sunrises lasted for hours up here, the dawn stretching itself across the horizon like something unwilling to end, painting the stone in golds and ambers that deepened so slowly you could watch a single shadow move across the terrace for the length of a meal and still not see it reach the wall.</w:t>
-      </w:r>
-    </w:p>
-    <w:p>
-      <w:pPr>
-        <w:pStyle w:val="BodyText"/>
-      </w:pPr>
-      <w:r>
-        <w:t xml:space="preserve">The garden was Maera’s. She had grown it from that terrace — not with Mold magic, which would have been faster, but with the Sing, which was slower and stranger and produced results that no other discipline could replicate. The flowers did not merely grow. They</w:t>
+        <w:t xml:space="preserve">The Cloud Palace sat at the highest point of the Cloud Kingdom, on a floating stone so vast it carried its own weather, a mass of ancient rock held aloft by Move magic so old it had become self-sustaining. Above the permanent mist line, where the sky opened in every direction and you could see three regions at once on a clear day, the world reduced to a blue so deep and so unbroken that it stopped being a color and became a feeling. The air was thin. Sound carried strangely — voices arrived before you expected them, as if the altitude compressed the distance between speaking and hearing. Light behaved differently too; sunrises lasted for hours up here, the dawn stretching itself across the horizon like something unwilling to end, painting the stone in golds and ambers that deepened so slowly you could watch a single shadow move across the terrace for the length of a meal and still not see it reach the wall.</w:t>
+      </w:r>
+    </w:p>
+    <w:p>
+      <w:pPr>
+        <w:pStyle w:val="BodyText"/>
+      </w:pPr>
+      <w:r>
+        <w:t xml:space="preserve">The garden was Maera’s. She had grown it from that terrace — not with Mold magic, which would have been faster, but with the Sing; slower, stranger, producing results that no other discipline could replicate. The flowers did not merely grow. They</w:t>
       </w:r>
       <w:r>
         <w:t xml:space="preserve"> </w:t>
@@ -6303,7 +6300,7 @@
         <w:pStyle w:val="BodyText"/>
       </w:pPr>
       <w:r>
-        <w:t xml:space="preserve">He could not have known, then, what the garden would cost. That Varas would come. That Aldric and Vero would be taken. That Maera — the Queen who Sang the flowers into memory, the last of the Cloud Singers, the woman who carried Fletcher’s bloodline not through Aldric’s distant, diluted echo but through the direct, unbroken line of Singers who had passed the Song from mother to daughter for three hundred years — would be left alone in a kingdom that no longer existed, carrying a second child she would not live to raise.</w:t>
+        <w:t xml:space="preserve">He could not have known, then, what the garden would cost. That Varas would come. That Aldric and Vero would be taken. That Maera, the Queen who Sang the flowers into memory, the last of the Cloud Singers, the woman who carried Fletcher’s bloodline through the direct, unbroken line of Singers who had passed the Song from mother to daughter for three hundred years, would be left alone in a kingdom that no longer existed, carrying a second child she would not live to raise.</w:t>
       </w:r>
     </w:p>
     <w:p>
@@ -6497,7 +6494,7 @@
         <w:pStyle w:val="BodyText"/>
       </w:pPr>
       <w:r>
-        <w:t xml:space="preserve">The Captain — a woman named Sera, silver-haired, who had held the post for thirty years and who moved with the economy of someone for whom every gesture was a statement and no statement was wasted — stood before them.</w:t>
+        <w:t xml:space="preserve">The Captain, a woman named Sera, silver-haired, who had held the post for thirty years and who moved with the economy of someone for whom every gesture was a statement and no statement was wasted, stood before them.</w:t>
       </w:r>
     </w:p>
     <w:p>
@@ -6518,6 +6515,14 @@
       </w:r>
       <w:r>
         <w:t xml:space="preserve">“Between the fire and the song. You will burn before the song goes silent. You will forget your own names before you forget theirs. You will carry what cannot be carried and hold what cannot be held and stand where no one can stand, and when the fire comes — and the fire always comes — you will be the last thing it touches and the first thing the song remembers.”</w:t>
+      </w:r>
+    </w:p>
+    <w:p>
+      <w:pPr>
+        <w:pStyle w:val="BodyText"/>
+      </w:pPr>
+      <w:r>
+        <w:t xml:space="preserve">The training had reflected the oath. The Vael Guard did not specialize. Specialization was a weakness: a wall built from one material breaks when that material fails. Sera had trained them in fragments of every discipline: enough Mold to raise a barrier, enough Move to deflect a blade, enough Heal to keep a charge breathing until the real Healers arrived. Halvar’s primary was the Mold: the staff, the stone, the conviction-based magic that came naturally to a man whose stubbornness was structural. But Sera had drilled the others into his muscle memory with the relentless, unsentimental efficiency of a woman who understood that a Guardian who could only do one thing was a Guardian who would die the first time that one thing wasn’t enough. The fragments were small. The fragments were survival.</w:t>
       </w:r>
     </w:p>
     <w:p>
@@ -6624,7 +6629,7 @@
         <w:pStyle w:val="BodyText"/>
       </w:pPr>
       <w:r>
-        <w:t xml:space="preserve">Halvar pressed his forehead to his knees. The shaking intensified. His body wanted the bottle the way a drowning man wants air — not as a desire but as a biological imperative, a system-level demand that bypassed will and arrived in the muscles as a scream.</w:t>
+        <w:t xml:space="preserve">Halvar pressed his forehead to his knees. The shaking intensified. His body wanted the bottle the way a drowning man wants air, not as a desire but as a biological imperative, a system-level demand that bypassed will and arrived in the muscles as a scream.</w:t>
       </w:r>
     </w:p>
     <w:p>
@@ -6640,7 +6645,7 @@
         <w:pStyle w:val="BodyText"/>
       </w:pPr>
       <w:r>
-        <w:t xml:space="preserve">He held it. The weight was familiar — the calibrated heft of a full bottle. He could feel the liquid shift inside, patient, waiting, offering the same bargain it had offered every night for fifteen years: drink, and the ghosts go quiet; drink, and the boy sleeps undisturbed; drink, and the crack in the foundation fills, temporarily, with something that is not love but occupies the same space.</w:t>
+        <w:t xml:space="preserve">He held it. The weight was familiar: the calibrated heft of a full bottle. He could feel the liquid shift inside, patient, waiting, offering the same bargain it had offered every night for fifteen years: drink, and the ghosts go quiet; drink, and the boy sleeps undisturbed; drink, and the crack in the foundation fills, temporarily, with something that is not love but occupies the same space.</w:t>
       </w:r>
     </w:p>
     <w:p>
@@ -6664,7 +6669,7 @@
         <w:pStyle w:val="BodyText"/>
       </w:pPr>
       <w:r>
-        <w:t xml:space="preserve">He drank. One long pull. The burn was immediate — not the gentle warmth of a social drink but the medicinal scorch of a man self-administering the only anesthetic available. It hit his stomach and radiated outward and the shaking diminished by half, and the ghosts in his bones lowered their voices, and the crack in the foundation filled with its familiar, temporary sealant.</w:t>
+        <w:t xml:space="preserve">He drank. One long pull. The burn was immediate, not the gentle warmth of a social drink but the medicinal scorch of a man self-administering the only anesthetic available. It hit his stomach and radiated outward and the shaking diminished by half, and the ghosts in his bones lowered their voices, and the crack in the foundation filled with its familiar, temporary sealant.</w:t>
       </w:r>
     </w:p>
     <w:p>
@@ -6708,15 +6713,15 @@
         <w:pStyle w:val="BodyText"/>
       </w:pPr>
       <w:r>
-        <w:t xml:space="preserve">A sound at the entrance of the hollow. Halvar’s hand went to the staff — instinct, muscle memory, the old training surfacing through the withdrawal like a reef through receding water. He turned.</w:t>
-      </w:r>
-    </w:p>
-    <w:p>
-      <w:pPr>
-        <w:pStyle w:val="BodyText"/>
-      </w:pPr>
-      <w:r>
-        <w:t xml:space="preserve">A woman stood at the edge of the amber light. Old. Canopy-born, by the look of her. Broad-shouldered, grey-haired, with the calloused hands of a woodworker and a merchant’s pack slung over one shoulder. She carried a tray of tincture bottles on a leather strap — the kind the Canopy traders sold at village crossroads, worthless remedies for ailments that didn’t exist.</w:t>
+        <w:t xml:space="preserve">A sound at the entrance of the hollow. Halvar’s hand went to the staff. Instinct, muscle memory, the old training surfacing through the withdrawal like a reef through receding water. He turned.</w:t>
+      </w:r>
+    </w:p>
+    <w:p>
+      <w:pPr>
+        <w:pStyle w:val="BodyText"/>
+      </w:pPr>
+      <w:r>
+        <w:t xml:space="preserve">A woman stood at the edge of the amber light. Old. Canopy-born, by the look of her. Broad-shouldered, grey-haired, with the calloused hands of a woodworker and a merchant’s pack slung over one shoulder. She carried a tray of tincture bottles on a leather strap, the kind the Canopy traders sold at village crossroads, worthless remedies for ailments that didn’t exist.</w:t>
       </w:r>
     </w:p>
     <w:p>
@@ -6860,7 +6865,7 @@
         <w:t xml:space="preserve">absence</w:t>
       </w:r>
       <w:r>
-        <w:t xml:space="preserve">. A hole in the world’s memory shaped like something too large to fit. You couldn’t see it. You could feel the edges.</w:t>
+        <w:t xml:space="preserve">; a hole in the world’s memory shaped like something too large to fit. You couldn’t see it. You could feel the edges.</w:t>
       </w:r>
     </w:p>
     <w:p>
@@ -7071,7 +7076,7 @@
         <w:pStyle w:val="BodyText"/>
       </w:pPr>
       <w:r>
-        <w:t xml:space="preserve">Halvar was on his feet before she cleared the first root. The staff hummed. The amber light flared, catching her face, and in the new light she looked — different. The same body, the same grey hair, the same broad shoulders. But the performance was gone. The mask of the Canopy trader had been set down somewhere in the forest between midnight and dawn, and what remained was the thing underneath: old, vast, and too heavy for the frame carrying it.</w:t>
+        <w:t xml:space="preserve">Halvar was on his feet before she cleared the first root. The staff hummed. The amber light flared, catching her face, and in the new light she looked different. The same body, the same grey hair, the same broad shoulders. But the performance was gone. The mask of the Canopy trader had been set down somewhere in the forest between midnight and dawn, and what remained was the thing underneath: old, vast, and too heavy for the frame carrying it.</w:t>
       </w:r>
     </w:p>
     <w:p>
@@ -7243,7 +7248,7 @@
         <w:pStyle w:val="BodyText"/>
       </w:pPr>
       <w:r>
-        <w:t xml:space="preserve">Halvar stood in the entrance of the hollow with the dawn coming through the canopy and the boy sleeping behind him and the god sitting on a root three feet away, and the fury in him was a living thing — hot, structural, load-bearing. It held up the walls. It kept the ceiling from coming down. If he let it go, if he set it down for even a moment, the entire architecture of the last fifteen years would collapse, and what would be left was a man with a ruined face and a shaking body and a boy he could not protect alone.</w:t>
+        <w:t xml:space="preserve">Halvar stood in the entrance of the hollow with the dawn coming through the canopy and the boy sleeping behind him and the god sitting on a root three feet away, and the fury in him was a living thing. Hot, structural, load-bearing. It held up the walls. It kept the ceiling from coming down. If he let it go, if he set it down for even a moment, the entire architecture of the last fifteen years would collapse, and what would be left was a man with a ruined face and a shaking body and a boy he could not protect alone.</w:t>
       </w:r>
     </w:p>
     <w:p>
@@ -9023,7 +9028,7 @@
         <w:pStyle w:val="BodyText"/>
       </w:pPr>
       <w:r>
-        <w:t xml:space="preserve">Aelo could feel it now — the age of things. Not as an abstraction but as a physical property, a density in the air and the soil and the wood that increased with every mile they walked south, away from the village, away from the trade roads, away from the administered world of survey stones and Mrak patrols and histories painted on schoolroom boards. The trees grew taller. Their trunks widened until some were broader than the cottage he had lived in for fifteen years, their bark dark and ridged and so deeply textured that it looked less like wood than like the face of something that had been staring at the sky for a thousand years and had stopped bothering to blink.</w:t>
+        <w:t xml:space="preserve">Aelo could feel it now, the age of things. Not as an abstraction but as a physical property, a density in the air and the soil and the wood that increased with every mile they walked south, away from the village, away from the trade roads, away from the administered world of survey stones and Mrak patrols and histories painted on schoolroom boards. The trees grew taller. Their trunks widened until some were broader than the cottage he had lived in for fifteen years, their bark dark and ridged and so deeply textured that it looked less like wood than like the face of something that had been staring at the sky for a thousand years and had stopped bothering to blink.</w:t>
       </w:r>
     </w:p>
     <w:p>
@@ -9146,7 +9151,7 @@
         <w:t xml:space="preserve"> </w:t>
       </w:r>
       <w:r>
-        <w:t xml:space="preserve">Sereth gestured. Aelo looked. She was right — the nearest trunks had tilted, minutely, imperceptibly to anyone who wasn’t looking for it, their canopies shifting to angle more of their leaves in his direction. As if he were a light source and they were orienting toward him.</w:t>
+        <w:t xml:space="preserve">Sereth gestured. Aelo looked. She was right. The nearest trunks had tilted, minutely, imperceptibly to anyone who wasn’t looking for it, their canopies shifting to angle more of their leaves in his direction. As if he were a light source and they were orienting toward him.</w:t>
       </w:r>
       <w:r>
         <w:t xml:space="preserve"> </w:t>
@@ -9341,7 +9346,7 @@
         <w:t xml:space="preserve"> </w:t>
       </w:r>
       <w:r>
-        <w:t xml:space="preserve">“She could hold five disciplines simultaneously. On the night she died, she held six. The seventh — the one she couldn’t reach — would have saved her.”</w:t>
+        <w:t xml:space="preserve">“She could hold five disciplines simultaneously. On the night she died, she held six. The seventh, the one she couldn’t reach, would have saved her.”</w:t>
       </w:r>
     </w:p>
     <w:p>
@@ -9421,7 +9426,7 @@
         <w:pStyle w:val="BodyText"/>
       </w:pPr>
       <w:r>
-        <w:t xml:space="preserve">It was guilt. Structural, load-bearing guilt — the kind that does not respond to time because it is not a feeling but a fact.</w:t>
+        <w:t xml:space="preserve">It was guilt. Structural, load-bearing guilt, the kind that does not respond to time because it is not a feeling but a fact.</w:t>
       </w:r>
     </w:p>
     <w:p>
@@ -9528,7 +9533,7 @@
         <w:pStyle w:val="BodyText"/>
       </w:pPr>
       <w:r>
-        <w:t xml:space="preserve">Aelo felt it before he saw it — a wall of memory so dense and so old that it registered as a physical presence, a pressure in the air ahead of them that increased with every step. The trees grew closer together. The undergrowth thickened. The whispers intensified, layering over each other until the sound was not voices but a</w:t>
+        <w:t xml:space="preserve">Aelo felt it before he saw it — a wall of memory so dense and so old that it registered as a physical presence. A pressure in the air ahead of them that increased with every step. The trees grew closer together. The undergrowth thickened. The whispers intensified, layering over each other until the sound was not voices but a</w:t>
       </w:r>
       <w:r>
         <w:t xml:space="preserve"> </w:t>
@@ -9560,17 +9565,17 @@
         <w:pStyle w:val="BodyText"/>
       </w:pPr>
       <w:r>
-        <w:t xml:space="preserve">A wall. Not built —</w:t>
-      </w:r>
-      <w:r>
-        <w:t xml:space="preserve"> </w:t>
-      </w:r>
-      <w:r>
-        <w:rPr>
-          <w:i/>
-          <w:iCs/>
-        </w:rPr>
-        <w:t xml:space="preserve">grown</w:t>
+        <w:t xml:space="preserve">A wall. Not built.</w:t>
+      </w:r>
+      <w:r>
+        <w:t xml:space="preserve"> </w:t>
+      </w:r>
+      <w:r>
+        <w:rPr>
+          <w:i/>
+          <w:iCs/>
+        </w:rPr>
+        <w:t xml:space="preserve">Grown</w:t>
       </w:r>
       <w:r>
         <w:t xml:space="preserve">. Canopy elms, hundreds of them, standing so close together that their trunks had fused over centuries, their bark merging into a continuous surface that rose fifty feet from the forest floor to the lower canopy. The wall curved away in both directions, disappearing into the forest, and Aelo understood — through the trees’ own memory, which poured into him without effort — that the curve was part of a circle, and the circle enclosed the entire inner Canopy, and the wall had been growing since before Varas, before Aldric, before the kingdoms.</w:t>
@@ -11811,7 +11816,7 @@
         <w:t xml:space="preserve"> </w:t>
       </w:r>
       <w:r>
-        <w:t xml:space="preserve">The Know, The Greensong</w:t>
+        <w:t xml:space="preserve">The Know, The Rootrun</w:t>
       </w:r>
     </w:p>
     <w:p>
@@ -11865,13 +11870,13 @@
           <w:b/>
           <w:bCs/>
         </w:rPr>
-        <w:t xml:space="preserve">The Greensong</w:t>
-      </w:r>
-      <w:r>
-        <w:t xml:space="preserve"> </w:t>
-      </w:r>
-      <w:r>
-        <w:t xml:space="preserve">— A form of trance-running where warriors synchronize their heartbeat with the forest’s rhythm. A Greensinger can travel at extraordinary speed for days. When they stop, the debt hits all at once: a runner who goes a week will sleep for a month.</w:t>
+        <w:t xml:space="preserve">The Rootrun</w:t>
+      </w:r>
+      <w:r>
+        <w:t xml:space="preserve"> </w:t>
+      </w:r>
+      <w:r>
+        <w:t xml:space="preserve">— A form of trance-running where warriors synchronize their heartbeat with the forest’s rhythm. A Rootrunner can travel at extraordinary speed for days. When they stop, the debt hits all at once: a runner who goes a week will sleep for a month.</w:t>
       </w:r>
     </w:p>
     <w:p>
@@ -12664,9 +12669,9 @@
         <w:tblLook w:firstRow="1" w:lastRow="0" w:firstColumn="0" w:lastColumn="0" w:noHBand="0" w:noVBand="0" w:val="0020"/>
       </w:tblPr>
       <w:tblGrid>
-        <w:gridCol w:w="1980"/>
-        <w:gridCol w:w="1650"/>
-        <w:gridCol w:w="4290"/>
+        <w:gridCol w:w="1200"/>
+        <w:gridCol w:w="1360"/>
+        <w:gridCol w:w="5360"/>
       </w:tblGrid>
       <w:tr>
         <w:trPr>
@@ -13054,7 +13059,7 @@
           <w:b/>
           <w:bCs/>
         </w:rPr>
-        <w:t xml:space="preserve">Greensong Running</w:t>
+        <w:t xml:space="preserve">Rootrunning</w:t>
       </w:r>
       <w:r>
         <w:t xml:space="preserve"> </w:t>
@@ -13127,13 +13132,14 @@
     <w:tbl>
       <w:tblPr>
         <w:tblStyle w:val="Table"/>
-        <w:tblW w:type="auto" w:w="0"/>
+        <w:tblW w:type="pct" w:w="5000"/>
+        <w:tblLayout w:type="fixed"/>
         <w:tblLook w:firstRow="1" w:lastRow="0" w:firstColumn="0" w:lastColumn="0" w:noHBand="0" w:noVBand="0" w:val="0020"/>
       </w:tblPr>
       <w:tblGrid>
-        <w:gridCol w:w="2640"/>
-        <w:gridCol w:w="2640"/>
-        <w:gridCol w:w="2640"/>
+        <w:gridCol w:w="2006"/>
+        <w:gridCol w:w="4118"/>
+        <w:gridCol w:w="1795"/>
       </w:tblGrid>
       <w:tr>
         <w:trPr>

</xml_diff>